<commit_message>
ADIB: workbook recalculates clean, document rebuilt on the class primary
</commit_message>
<xml_diff>
--- a/engine/adib_study/ADIB_Valuation_Study_09-09-2026.docx
+++ b/engine/adib_study/ADIB_Valuation_Study_09-09-2026.docx
@@ -4306,7 +4306,7 @@
           <w:color w:val="1C3A36"/>
           <w:sz w:val="21"/>
         </w:rPr>
-        <w:t>At the central the shares stand on 1.15 times forecast 2026 book and 4.1 times forecast 2026 earnings. At the market they stand on 1.60 times and 5.8 times. Applying the price-to-book and price-to-earnings bands Egyptian large-cap banks trade in to the 2026 forecast gives EGP 60.82 a share.</w:t>
+        <w:t>At the central the shares stand on 1.26 times forecast 2026 book and 4.5 times forecast 2026 earnings. At the market they stand on 1.60 times and 5.8 times. Applying the price-to-book and price-to-earnings bands Egyptian large-cap banks trade in to the 2026 forecast gives EGP 60.82 a share.</w:t>
       </w:r>
     </w:p>
     <w:tbl>
@@ -5769,7 +5769,7 @@
           <w:color w:val="1C3A36"/>
           <w:sz w:val="21"/>
         </w:rPr>
-        <w:t>The June 2026 half printed a 38.6% annualised return on equity and charged 2.176 million of credit losses. Annualise that half and the bank earns about EGP 15.1 billion in 2026 and the shares are on four times earnings. Do it for five years and this study's central is EGP 48.04 a share rather than EGP 37.18. But a half-year at a 0.003% loss rate is not a business model; it is a release, on a book that carried charges of 2.7% of financing in both 2023 and 2024. The bank is growing customer financing at close to 30% a half — new lending does not default in its first year, and the loss charge on it arrives later.</w:t>
+        <w:t>The June 2026 half printed a 38.6% annualised return on equity and charged 2.176 million of credit losses. Annualise that half and the bank earns about EGP 15.1 billion in 2026 and the shares are on four times earnings. Do it for five years and this study's central is EGP 50.50 a share rather than EGP 37.18. But a half-year at a 0.003% loss rate is not a business model; it is a release, on a book that carried charges of 2.7% of financing in both 2023 and 2024. The bank is growing customer financing at close to 30% a half — new lending does not default in its first year, and the loss charge on it arrives later.</w:t>
       </w:r>
     </w:p>
     <w:p>
@@ -6933,7 +6933,7 @@
                 <w:color w:val="1C3A36"/>
                 <w:sz w:val="19"/>
               </w:rPr>
-              <w:t>ONE INPUT IN THIS STUDY IS STALE AND IT IS THE MOST IMPORTANT ONE. The Egyptian ten-year yield of 23.00% is dated 6 August 2026 — 34 days before the price this study is struck against, and beyond the fortnight this house allows such a quote to stand. A live re-source was attempted on 9 September down four routes and all four failed: the central bank's bond-auction pages return an error, its data endpoint returns the website rather than the data, and two market-data providers render their yield tables in a way that cannot be read without a browser. The only recent evidence found is that the same yield averaged 21.29% between late April and late May 2026, which is 171 basis points BELOW what this study is carrying. At that rate the central would be EGP 43.74 rather than EGP 37.18. The rate is carried, the staleness is declared, the sensitivity is in 1.9, and a current quote is the first thing this study would want.</w:t>
+              <w:t>ONE INPUT IN THIS STUDY IS STALE AND IT IS THE MOST IMPORTANT ONE. The Egyptian ten-year yield of 23.00% is dated 6 August 2026 — 34 days before the price this study is struck against, and beyond the fortnight this house allows such a quote to stand. A live re-source was attempted on 9 September down four routes and all four failed: the central bank's bond-auction pages return an error, its data endpoint returns the website rather than the data, and two market-data providers render their yield tables in a way that cannot be read without a browser. The only recent evidence found is that the same yield averaged 21.29% between late April and late May 2026, which is 171 basis points BELOW what this study is carrying. At that rate the central would be EGP 46.44 rather than EGP 37.18. The rate is carried, the staleness is declared, the sensitivity is in 1.9, and a current quote is the first thing this study would want.</w:t>
             </w:r>
           </w:p>
         </w:tc>
@@ -8904,7 +8904,7 @@
           <w:color w:val="1C3A36"/>
           <w:sz w:val="21"/>
         </w:rPr>
-        <w:t>The one number that matters is the expected-credit-loss line. If the nine months to September still carry almost no charge, the case for this study's 1.00% assumption weakens sharply and the central moves toward EGP 48.04. If the charge normalises in the third quarter, it strengthens.</w:t>
+        <w:t>The one number that matters is the expected-credit-loss line. If the nine months to September still carry almost no charge, the case for this study's 1.00% assumption weakens sharply and the central moves toward EGP 50.50. If the charge normalises in the third quarter, it strengthens.</w:t>
       </w:r>
     </w:p>
     <w:p>
@@ -8988,7 +8988,7 @@
           <w:color w:val="1C3A36"/>
           <w:sz w:val="21"/>
         </w:rPr>
-        <w:t>Not a company event, but the largest single uncertainty in this study. The rate it uses is 34 days old; the only recent market evidence points 171 basis points lower, and that alone is worth EGP 6.57 a share.</w:t>
+        <w:t>Not a company event, but the largest single uncertainty in this study. The rate it uses is 34 days old; the only recent market evidence points 171 basis points lower, and that alone is worth EGP 9.26 a share.</w:t>
       </w:r>
     </w:p>
     <w:p>
@@ -9164,7 +9164,7 @@
           <w:color w:val="1C3A36"/>
           <w:sz w:val="21"/>
         </w:rPr>
-        <w:t>The bank charged 2.176 million of credit losses in six months. This study assumes 1.00% of average financing in 2026 and 1.30% after. If the release proves structural the central is EGP 48.04; if the loss charge returns to its 2022-25 mean of 2.09% it is nearer EGP 22.00. Both ends are plausible on the evidence in hand.</w:t>
+        <w:t>The bank charged 2.176 million of credit losses in six months. This study assumes 1.00% of average financing in 2026 and 1.30% after. If the release proves structural the central is EGP 50.50; if the loss charge returns to its 2022-25 mean of 2.09% it is nearer EGP 22.00. Both ends are plausible on the evidence in hand.</w:t>
       </w:r>
     </w:p>
     <w:p>
@@ -9185,7 +9185,7 @@
           <w:color w:val="1C3A36"/>
           <w:sz w:val="21"/>
         </w:rPr>
-        <w:t>Named already in 1.8 and repeated here because it is the largest single uncertainty. Four live re-source routes failed on the study date. The only recent market evidence found points 171 basis points below the rate carried, which alone is worth EGP 6.57 a share.</w:t>
+        <w:t>Named already in 1.8 and repeated here because it is the largest single uncertainty. Four live re-source routes failed on the study date. The only recent market evidence found points 171 basis points below the rate carried, which alone is worth EGP 9.26 a share.</w:t>
       </w:r>
     </w:p>
     <w:p>
@@ -15101,7 +15101,7 @@
           <w:color w:val="1C3A36"/>
           <w:sz w:val="21"/>
         </w:rPr>
-        <w:t>"And I would point out where that rate comes from: a ten-year yield printed on 6 August, thirty-four days before the price. In late April and May the same yield was averaging 21.29%. Put 21.29% in and the answer is EGP 43.74. Put in what the market is implying and the answer is the market. I am not saying the model is wrong. I am saying the largest input in it is a month old and the study should say so — which, to its credit, it does."</w:t>
+        <w:t>"And I would point out where that rate comes from: a ten-year yield printed on 6 August, thirty-four days before the price. In late April and May the same yield was averaging 21.29%. Put 21.29% in and the answer is EGP 46.44. Put in what the market is implying and the answer is the market. I am not saying the model is wrong. I am saying the largest input in it is a month old and the study should say so — which, to its credit, it does."</w:t>
       </w:r>
     </w:p>
     <w:p>

</xml_diff>